<commit_message>
Updated state transition diagrams 10/25
updated state transition diagrams + state definitions
</commit_message>
<xml_diff>
--- a/week 3 checkpoint/State transition diagram + state definitions.docx
+++ b/week 3 checkpoint/State transition diagram + state definitions.docx
@@ -18,16 +18,20 @@
           <w:sz w:val="20"/>
           <w:szCs w:val="20"/>
         </w:rPr>
-        <w:t>1</w:t>
+        <w:t>1. State transition diagram</w:t>
       </w:r>
-      <w:r>
-        <w:rPr>
-          <w:color w:val="000000" w:themeColor="text1"/>
-          <w:sz w:val="20"/>
-          <w:szCs w:val="20"/>
-        </w:rPr>
-        <w:t>. State transition diagram</w:t>
-      </w:r>
+    </w:p>
+    <w:p>
+      <w:pPr>
+        <w:spacing w:after="200"/>
+        <w:jc w:val="center"/>
+      </w:pPr>
+    </w:p>
+    <w:p>
+      <w:pPr>
+        <w:spacing w:after="200"/>
+        <w:jc w:val="center"/>
+      </w:pPr>
     </w:p>
     <w:p>
       <w:pPr>
@@ -39,10 +43,10 @@
           <w:noProof/>
         </w:rPr>
         <w:drawing>
-          <wp:inline distT="0" distB="0" distL="0" distR="0" wp14:anchorId="263C31DE" wp14:editId="07CB572F">
-            <wp:extent cx="5943600" cy="7674610"/>
+          <wp:inline distT="0" distB="0" distL="0" distR="0" wp14:anchorId="57FEB67A" wp14:editId="70154917">
+            <wp:extent cx="5286375" cy="2331992"/>
             <wp:effectExtent l="0" t="0" r="0" b="0"/>
-            <wp:docPr id="397727942" name="Picture 1"/>
+            <wp:docPr id="46885990" name="Picture 2"/>
             <wp:cNvGraphicFramePr>
               <a:graphicFrameLocks xmlns:a="http://schemas.openxmlformats.org/drawingml/2006/main" noChangeAspect="1"/>
             </wp:cNvGraphicFramePr>
@@ -50,7 +54,7 @@
               <a:graphicData uri="http://schemas.openxmlformats.org/drawingml/2006/picture">
                 <pic:pic xmlns:pic="http://schemas.openxmlformats.org/drawingml/2006/picture">
                   <pic:nvPicPr>
-                    <pic:cNvPr id="397727942" name="Picture 397727942"/>
+                    <pic:cNvPr id="46885990" name="Picture 46885990"/>
                     <pic:cNvPicPr/>
                   </pic:nvPicPr>
                   <pic:blipFill>
@@ -68,7 +72,7 @@
                   <pic:spPr>
                     <a:xfrm>
                       <a:off x="0" y="0"/>
-                      <a:ext cx="5943600" cy="7674610"/>
+                      <a:ext cx="5303868" cy="2339709"/>
                     </a:xfrm>
                     <a:prstGeom prst="rect">
                       <a:avLst/>
@@ -83,6 +87,18 @@
     </w:p>
     <w:p>
       <w:pPr>
+        <w:spacing w:after="200"/>
+        <w:jc w:val="center"/>
+      </w:pPr>
+    </w:p>
+    <w:p>
+      <w:pPr>
+        <w:spacing w:after="200"/>
+        <w:jc w:val="center"/>
+      </w:pPr>
+    </w:p>
+    <w:p>
+      <w:pPr>
         <w:pStyle w:val="Heading1"/>
         <w:spacing w:before="300" w:after="150"/>
         <w:rPr>
@@ -97,16 +113,7 @@
           <w:sz w:val="20"/>
           <w:szCs w:val="20"/>
         </w:rPr>
-        <w:lastRenderedPageBreak/>
-        <w:t>2</w:t>
-      </w:r>
-      <w:r>
-        <w:rPr>
-          <w:color w:val="000000" w:themeColor="text1"/>
-          <w:sz w:val="20"/>
-          <w:szCs w:val="20"/>
-        </w:rPr>
-        <w:t>. State definitions</w:t>
+        <w:t>2. State definitions</w:t>
       </w:r>
     </w:p>
     <w:tbl>
@@ -131,12 +138,6 @@
         <w:gridCol w:w="7300"/>
       </w:tblGrid>
       <w:tr>
-        <w:tblPrEx>
-          <w:tblCellMar>
-            <w:top w:w="0" w:type="dxa"/>
-            <w:bottom w:w="0" w:type="dxa"/>
-          </w:tblCellMar>
-        </w:tblPrEx>
         <w:tc>
           <w:tcPr>
             <w:tcW w:w="2400" w:type="dxa"/>
@@ -183,12 +184,6 @@
         </w:tc>
       </w:tr>
       <w:tr>
-        <w:tblPrEx>
-          <w:tblCellMar>
-            <w:top w:w="0" w:type="dxa"/>
-            <w:bottom w:w="0" w:type="dxa"/>
-          </w:tblCellMar>
-        </w:tblPrEx>
         <w:tc>
           <w:tcPr>
             <w:tcW w:w="2400" w:type="dxa"/>
@@ -201,7 +196,7 @@
           </w:tcPr>
           <w:p>
             <w:r>
-              <w:t>Available</w:t>
+              <w:t>Draft</w:t>
             </w:r>
           </w:p>
         </w:tc>
@@ -217,21 +212,12 @@
           </w:tcPr>
           <w:p>
             <w:r>
-              <w:t xml:space="preserve">The </w:t>
-            </w:r>
-            <w:r>
-              <w:t>book(s) is available to checkout</w:t>
+              <w:t xml:space="preserve">The reader is preparing a checkout request and has not submitted it yet. </w:t>
             </w:r>
           </w:p>
         </w:tc>
       </w:tr>
       <w:tr>
-        <w:tblPrEx>
-          <w:tblCellMar>
-            <w:top w:w="0" w:type="dxa"/>
-            <w:bottom w:w="0" w:type="dxa"/>
-          </w:tblCellMar>
-        </w:tblPrEx>
         <w:tc>
           <w:tcPr>
             <w:tcW w:w="2400" w:type="dxa"/>
@@ -244,7 +230,7 @@
           </w:tcPr>
           <w:p>
             <w:r>
-              <w:t>Checked Out</w:t>
+              <w:t>Submitted</w:t>
             </w:r>
           </w:p>
         </w:tc>
@@ -260,27 +246,12 @@
           </w:tcPr>
           <w:p>
             <w:r>
-              <w:t xml:space="preserve">The </w:t>
-            </w:r>
-            <w:r>
-              <w:t>book</w:t>
-            </w:r>
-            <w:r>
-              <w:t xml:space="preserve"> </w:t>
-            </w:r>
-            <w:r>
-              <w:t>is not available to check out anymore, needs to wait for another reader to return the book</w:t>
+              <w:t xml:space="preserve">The reader has submitted the checkout request and it is waiting for validation. </w:t>
             </w:r>
           </w:p>
         </w:tc>
       </w:tr>
       <w:tr>
-        <w:tblPrEx>
-          <w:tblCellMar>
-            <w:top w:w="0" w:type="dxa"/>
-            <w:bottom w:w="0" w:type="dxa"/>
-          </w:tblCellMar>
-        </w:tblPrEx>
         <w:tc>
           <w:tcPr>
             <w:tcW w:w="2400" w:type="dxa"/>
@@ -293,7 +264,7 @@
           </w:tcPr>
           <w:p>
             <w:r>
-              <w:t>Renewed</w:t>
+              <w:t>Completed</w:t>
             </w:r>
           </w:p>
         </w:tc>
@@ -309,35 +280,12 @@
           </w:tcPr>
           <w:p>
             <w:r>
-              <w:t xml:space="preserve">The </w:t>
-            </w:r>
-            <w:r>
-              <w:t>reader</w:t>
-            </w:r>
-            <w:r>
-              <w:t xml:space="preserve"> extended the loan before the due date. The due date moves </w:t>
-            </w:r>
-            <w:proofErr w:type="gramStart"/>
-            <w:r>
-              <w:t>forward</w:t>
-            </w:r>
-            <w:proofErr w:type="gramEnd"/>
-            <w:r>
-              <w:t xml:space="preserve"> and </w:t>
-            </w:r>
-            <w:r>
-              <w:t xml:space="preserve">the reader keeps the book for a longer period. </w:t>
+              <w:t xml:space="preserve">The request passed validation and the checkout was approved. This is the end state. </w:t>
             </w:r>
           </w:p>
         </w:tc>
       </w:tr>
       <w:tr>
-        <w:tblPrEx>
-          <w:tblCellMar>
-            <w:top w:w="0" w:type="dxa"/>
-            <w:bottom w:w="0" w:type="dxa"/>
-          </w:tblCellMar>
-        </w:tblPrEx>
         <w:tc>
           <w:tcPr>
             <w:tcW w:w="2400" w:type="dxa"/>
@@ -350,7 +298,7 @@
           </w:tcPr>
           <w:p>
             <w:r>
-              <w:t>Overdue</w:t>
+              <w:t>Rejected</w:t>
             </w:r>
           </w:p>
         </w:tc>
@@ -366,110 +314,10 @@
           </w:tcPr>
           <w:p>
             <w:r>
-              <w:t xml:space="preserve">The due date has passed while the </w:t>
+              <w:t xml:space="preserve">The request failed a validation or business rule. The reader can edit it and </w:t>
             </w:r>
             <w:r>
-              <w:t xml:space="preserve">reader still </w:t>
-            </w:r>
-            <w:proofErr w:type="gramStart"/>
-            <w:r>
-              <w:t>have</w:t>
-            </w:r>
-            <w:proofErr w:type="gramEnd"/>
-            <w:r>
-              <w:t xml:space="preserve"> the book</w:t>
-            </w:r>
-          </w:p>
-        </w:tc>
-      </w:tr>
-      <w:tr>
-        <w:tblPrEx>
-          <w:tblCellMar>
-            <w:top w:w="0" w:type="dxa"/>
-            <w:bottom w:w="0" w:type="dxa"/>
-          </w:tblCellMar>
-        </w:tblPrEx>
-        <w:tc>
-          <w:tcPr>
-            <w:tcW w:w="2400" w:type="dxa"/>
-            <w:tcMar>
-              <w:top w:w="100" w:type="dxa"/>
-              <w:left w:w="120" w:type="dxa"/>
-              <w:bottom w:w="100" w:type="dxa"/>
-              <w:right w:w="120" w:type="dxa"/>
-            </w:tcMar>
-          </w:tcPr>
-          <w:p>
-            <w:r>
-              <w:t>Returned</w:t>
-            </w:r>
-          </w:p>
-        </w:tc>
-        <w:tc>
-          <w:tcPr>
-            <w:tcW w:w="7300" w:type="dxa"/>
-            <w:tcMar>
-              <w:top w:w="100" w:type="dxa"/>
-              <w:left w:w="120" w:type="dxa"/>
-              <w:bottom w:w="100" w:type="dxa"/>
-              <w:right w:w="120" w:type="dxa"/>
-            </w:tcMar>
-          </w:tcPr>
-          <w:p>
-            <w:r>
-              <w:t xml:space="preserve">The </w:t>
-            </w:r>
-            <w:r>
-              <w:t>book</w:t>
-            </w:r>
-            <w:r>
-              <w:t xml:space="preserve"> has been physically checked in by staff or the kiosk. </w:t>
-            </w:r>
-          </w:p>
-        </w:tc>
-      </w:tr>
-      <w:tr>
-        <w:tblPrEx>
-          <w:tblCellMar>
-            <w:top w:w="0" w:type="dxa"/>
-            <w:bottom w:w="0" w:type="dxa"/>
-          </w:tblCellMar>
-        </w:tblPrEx>
-        <w:tc>
-          <w:tcPr>
-            <w:tcW w:w="2400" w:type="dxa"/>
-            <w:tcMar>
-              <w:top w:w="100" w:type="dxa"/>
-              <w:left w:w="120" w:type="dxa"/>
-              <w:bottom w:w="100" w:type="dxa"/>
-              <w:right w:w="120" w:type="dxa"/>
-            </w:tcMar>
-          </w:tcPr>
-          <w:p>
-            <w:r>
-              <w:t>Lost / Damaged</w:t>
-            </w:r>
-          </w:p>
-        </w:tc>
-        <w:tc>
-          <w:tcPr>
-            <w:tcW w:w="7300" w:type="dxa"/>
-            <w:tcMar>
-              <w:top w:w="100" w:type="dxa"/>
-              <w:left w:w="120" w:type="dxa"/>
-              <w:bottom w:w="100" w:type="dxa"/>
-              <w:right w:w="120" w:type="dxa"/>
-            </w:tcMar>
-          </w:tcPr>
-          <w:p>
-            <w:r>
-              <w:t xml:space="preserve">The </w:t>
-            </w:r>
-            <w:r>
-              <w:t>book</w:t>
-            </w:r>
-            <w:r>
-              <w:t xml:space="preserve"> is reported lost (directly from Overdue, no physical return) or found damaged at check-in (from Returned). </w:t>
+              <w:t>resubmit a new checkout request</w:t>
             </w:r>
           </w:p>
         </w:tc>
@@ -491,15 +339,7 @@
           <w:sz w:val="20"/>
           <w:szCs w:val="20"/>
         </w:rPr>
-        <w:t>3</w:t>
-      </w:r>
-      <w:r>
-        <w:rPr>
-          <w:color w:val="000000" w:themeColor="text1"/>
-          <w:sz w:val="20"/>
-          <w:szCs w:val="20"/>
-        </w:rPr>
-        <w:t>. Key transitions</w:t>
+        <w:t>3. Key transitions</w:t>
       </w:r>
     </w:p>
     <w:p>
@@ -512,7 +352,7 @@
         <w:spacing w:after="80"/>
       </w:pPr>
       <w:r>
-        <w:t>Available → Checked Out: checkout request approved.</w:t>
+        <w:t>Start → Draft: reader begins a new checkout request.</w:t>
       </w:r>
     </w:p>
     <w:p>
@@ -525,7 +365,7 @@
         <w:spacing w:after="80"/>
       </w:pPr>
       <w:r>
-        <w:t xml:space="preserve">Checked Out → Renewed: renewal requested before due date </w:t>
+        <w:t>Draft → Submitted: reader submits the request.</w:t>
       </w:r>
     </w:p>
     <w:p>
@@ -538,7 +378,7 @@
         <w:spacing w:after="80"/>
       </w:pPr>
       <w:r>
-        <w:t>Checked Out / Renewed → Overdue: due date passes with no return or renewal.</w:t>
+        <w:t>Submitted → Completed: request passes validation and business rules.</w:t>
       </w:r>
     </w:p>
     <w:p>
@@ -551,19 +391,7 @@
         <w:spacing w:after="80"/>
       </w:pPr>
       <w:r>
-        <w:t xml:space="preserve">Checked Out / Renewed / Overdue → Returned: </w:t>
-      </w:r>
-      <w:r>
-        <w:t>reader</w:t>
-      </w:r>
-      <w:r>
-        <w:t xml:space="preserve"> returns the </w:t>
-      </w:r>
-      <w:r>
-        <w:t>book</w:t>
-      </w:r>
-      <w:r>
-        <w:t>, on time or late.</w:t>
+        <w:t>Submitted → Rejected: request fails a validation or business rule.</w:t>
       </w:r>
     </w:p>
     <w:p>
@@ -576,51 +404,10 @@
         <w:spacing w:after="80"/>
       </w:pPr>
       <w:r>
-        <w:t xml:space="preserve">Returned → Available: </w:t>
+        <w:t xml:space="preserve">Rejected → Draft: reader </w:t>
       </w:r>
       <w:r>
-        <w:t>book</w:t>
-      </w:r>
-      <w:r>
-        <w:t xml:space="preserve"> checked in and passes condition inspection.</w:t>
-      </w:r>
-    </w:p>
-    <w:p>
-      <w:pPr>
-        <w:pStyle w:val="ListParagraph"/>
-        <w:numPr>
-          <w:ilvl w:val="0"/>
-          <w:numId w:val="1"/>
-        </w:numPr>
-        <w:spacing w:after="80"/>
-      </w:pPr>
-      <w:r>
-        <w:t xml:space="preserve">Returned → Lost/Damaged: </w:t>
-      </w:r>
-      <w:r>
-        <w:t>book</w:t>
-      </w:r>
-      <w:r>
-        <w:t xml:space="preserve"> checked in but found damaged.</w:t>
-      </w:r>
-    </w:p>
-    <w:p>
-      <w:pPr>
-        <w:pStyle w:val="ListParagraph"/>
-        <w:numPr>
-          <w:ilvl w:val="0"/>
-          <w:numId w:val="1"/>
-        </w:numPr>
-        <w:spacing w:after="80"/>
-      </w:pPr>
-      <w:r>
-        <w:t xml:space="preserve">Overdue → Lost/Damaged: </w:t>
-      </w:r>
-      <w:r>
-        <w:t>book</w:t>
-      </w:r>
-      <w:r>
-        <w:t xml:space="preserve"> reported lost while still outstanding.</w:t>
+        <w:t xml:space="preserve">can edit and resubmit a new checkout request. </w:t>
       </w:r>
     </w:p>
     <w:sectPr>

</xml_diff>